<commit_message>
SCEM: the bear corner is the going-concern floor, and the page now says so
The headline and the lens caption both described the bear corner as 'the lowest
margin the company has ever filed'. It is not, and it stopped being that the
moment the terminal moved onto the disclosed twenty-year machinery life: at the
FY2023 margin of 6.6 per cent terminal free cash flow turns negative and the
sanctioned module refuses, because a going concern consuming cash for ever is a
liquidation and must be valued as one. The bound published is 8.0 per cent, the
lowest margin at which the going-concern reading survives, solved on the refusal
itself rather than on a value.

Found by reading the rendered PDF rather than by any check, which is what that
gate is for: every figure on the page was computed and correct, and the sentence
around them described a construction the model had stopped using.

Co-Authored-By: testahil-walkforward-runner <noreply@testahil.com>
</commit_message>
<xml_diff>
--- a/engine/scem_study/SCEM_Valuation_Study_07-09-2026_public.docx
+++ b/engine/scem_study/SCEM_Valuation_Study_07-09-2026_public.docx
@@ -174,7 +174,7 @@
                 <w:color w:val="1C3A36"/>
                 <w:sz w:val="19"/>
               </w:rPr>
-              <w:t>The cash-flow lens is the answer: EGP 116.93 a share against a market price of EGP 100.50, +16.3%. Flexing the operating margin down to the lowest the company has ever filed takes it to EGP 21.60, and the forecast opens above the best year it has filed, so essentially the whole of that range is downside. The other lenses are published beside it rather than averaged into it: replacement cost EGP 94.23, an enterprise multiple EGP 62.11, and a disclosed book floor of EGP 27.12.</w:t>
+              <w:t>The cash-flow lens is the answer: EGP 116.93 a share against a market price of EGP 100.50, +16.3%. Flexing the operating margin down to 8.0% takes it to EGP 21.60 — and that is not the lowest margin the company has filed but the lowest at which this remains a GOING CONCERN, because below it the terminal consumes cash for ever and would have to be valued as a liquidation rather than at a smaller number. The forecast opens above the best year the company has filed, so essentially the whole of that range is downside. The other lenses are published beside it rather than averaged into it: replacement cost EGP 94.23, an enterprise multiple EGP 62.11, and a disclosed book floor of EGP 27.12.</w:t>
             </w:r>
           </w:p>
         </w:tc>
@@ -6240,7 +6240,7 @@
           <w:color w:val="6E7B77"/>
           <w:sz w:val="17"/>
         </w:rPr>
-        <w:t>Table 8 — The lenses side by side. NOTHING IS WEIGHTED: the cash-flow read is the central and the others are cross-checks. Its bear corner flexes the operating margin down to the lowest the company has filed and holds the macro path still; its bull corner is the base case, because the forecast already opens above the best margin the company has ever filed and this driver has no upside left against its own record.</w:t>
+        <w:t>Table 8 — The lenses side by side. NOTHING IS WEIGHTED: the cash-flow read is the central and the others are cross-checks. Its bear corner flexes the operating margin down to 8.0% and holds the macro path still. THAT IS NOT THE LOWEST MARGIN THE COMPANY HAS FILED, which is 6.6%: at that margin terminal free cash flow on the disclosed twenty-year machinery life is negative, and a going concern consuming cash for ever is a liquidation rather than a lower valuation — so the bound published is the lowest margin at which the going-concern reading survives, and below it the disclosed book value is the floor. Its bull corner is the base case, because the forecast already opens above the best margin the company has ever filed and this driver has no upside left against its own record.</w:t>
       </w:r>
     </w:p>
     <w:p>

</xml_diff>